<commit_message>
Thesis Chapter 3: research gap restored to the original August wording
Co-Authored-By: Claude Fable 5.1 <noreply@anthropic.com>
Claude-Session: https://claude.ai/code/session_01QHSSv245Aernyaebt7V5kS
</commit_message>
<xml_diff>
--- a/docs/Yasir_Thesis_Chapter3.docx
+++ b/docs/Yasir_Thesis_Chapter3.docx
@@ -107,221 +107,39 @@
       </w:r>
     </w:p>
     <w:p>
-      <w:pPr>
-        <w:spacing w:after="110" w:line="264" w:lineRule="auto"/>
-        <w:jc w:val="both"/>
-      </w:pPr>
-      <w:r>
-        <w:t xml:space="preserve">The systematic literature review shows much work on individual mechanisms for securing healthcare data sharing, but also a conceptual and architectural fragmentation among these mechanisms. They are commonly investigated as independent technical solutions rather than as coordinated components of a unified trust-oriented authorisation model. The few studies that coordinate several of them in one decision (Ferreira et al. 2025; Panagoulias et al. 2026; Phuyal et al. 2026b; Punia et al. 2025; Shanmugham &amp; Senthilkumar 2026) do not make multi-party approval a standing condition of that decision. Some of them test their own decisions empirically, but none proves or tests a conjunction that includes multi-party approval.</w:t>
-      </w:r>
-    </w:p>
-    <w:p>
-      <w:pPr>
-        <w:spacing w:after="110" w:line="264" w:lineRule="auto"/>
-        <w:jc w:val="both"/>
-      </w:pPr>
-      <w:r>
-        <w:t xml:space="preserve">The central gap is the absence of an integrated model explaining how these mechanisms collectively establish a trustworthy authorisation decision. Existing consent-oriented approaches tend to treat consent primarily as a record of a patient’s permission (Akter &amp; Sanam 2025; Prashanth et al. 2024), and some claim consent but leave it out of the access decision (Sawant &amp; Gomes 2026). Once the permission has been created and stored, subsequent access control may depend predominantly on the existence of the consent record and the successful authentication of the requester. Even the evaluable consent objects reported since 2020 (Albalwy, Brass &amp; Davies 2021; Eneh et al. 2026; Phuyal et al. 2026b; Shanmugham &amp; Senthilkumar 2026; Tith et al. 2020) carry only a subset of the conditions and are issued by a single party. Such a model establishes evidence that a consent decision occurred, but it does not necessarily establish that the requester possesses the required authority, that all required parties have independently approved the access, or that the requested operation is consistent with the purpose and data scope authorised by the patient.</w:t>
-      </w:r>
-    </w:p>
-    <w:p>
-      <w:pPr>
-        <w:spacing w:after="110" w:line="264" w:lineRule="auto"/>
-        <w:jc w:val="both"/>
-      </w:pPr>
-      <w:r>
-        <w:t>Recording consent and enforcing trustworthy authorisation are two different security problems. A blockchain may provide an immutable representation of a consent event (Andrew et al. 2023; Tawfik et al. 2025), but immutability does not establish the legitimacy of the entities involved in that event. Similarly, a valid decentralised identity can establish who a participant is (Mazzocca et al. 2025), but it does not necessarily establish what that participant is authorised to do. Multi-party approval can strengthen collective decision-making, but approval alone does not guarantee that the resulting access request conforms to the patient’s authorised purpose or data scope. In the reviewed studies, multi-party approval is never conjoined with a purpose condition (Madine et al. 2020; Punia et al. 2025; Tan, Chi &amp; Lam 2024). Consequently, trust cannot be attributed to any individual mechanism in isolation. From a Trust Computing perspective, trustworthy access should be understood as an outcome of the coordinated satisfaction of multiple independently verifiable conditions. In this research, trust is a property of a verifiable authorisation process, not an attribute of one entity or technology.</w:t>
-      </w:r>
-    </w:p>
-    <w:p>
-      <w:pPr>
-        <w:spacing w:after="110" w:line="264" w:lineRule="auto"/>
-        <w:jc w:val="both"/>
-      </w:pPr>
-      <w:r>
-        <w:t xml:space="preserve">The identified gap can therefore be stated as follows: existing healthcare consent and access-control research provides many of the necessary technological building blocks. However, there is still a need for an integrated Trust Computing framework that treats patient consent as a verifiable authorisation object, verifies identity, trust, and authority, supports multi-party authorisation, and enforces access policies and data-scope restrictions. In this framework, the consent object carries identity, authority, threshold, policy, temporal, and lifecycle conditions, multi-party approval must be a standing condition of every access decision, and the conjunction of these conditions must be formally and empirically assured. These two requirements correspond to the </w:t>
-      </w:r>
-      <w:r>
-        <w:rPr>
-          <w:b/>
-          <w:bCs/>
-        </w:rPr>
-        <w:t>conjunction gap</w:t>
-      </w:r>
-      <w:r>
-        <w:t xml:space="preserve"> and the </w:t>
-      </w:r>
-      <w:r>
-        <w:rPr>
-          <w:b/>
-          <w:bCs/>
-        </w:rPr>
-        <w:t>assurance gap</w:t>
-      </w:r>
-      <w:r>
-        <w:t xml:space="preserve"> identified in </w:t>
-      </w:r>
-      <w:r>
-        <w:rPr>
-          <w:color w:val="FF0000"/>
-        </w:rPr>
-        <w:t>Chapter 2</w:t>
-      </w:r>
-      <w:r>
-        <w:t>. The approving set must be defined by the patient rather than by an institution, whereas in the reviewed studies, the approving set is either defined on the institutional or delegate side (Punia et al. 2025; Wu et al. 2022; Zhao &amp; Su 2024), or appointed by the patient (Maruthi &amp; Singh 2025; Tan, Chi &amp; Lam 2024) but evaluated only as a contingency path or as a key-custody threshold.</w:t>
-      </w:r>
-    </w:p>
-    <w:p>
-      <w:pPr>
-        <w:spacing w:after="110" w:line="264" w:lineRule="auto"/>
-        <w:jc w:val="both"/>
-      </w:pPr>
-      <w:r>
-        <w:t xml:space="preserve">The requirement-level gaps identified in </w:t>
-      </w:r>
-      <w:r>
-        <w:rPr>
-          <w:color w:val="FF0000"/>
-        </w:rPr>
-        <w:t>Chapter 2</w:t>
-      </w:r>
-      <w:r>
-        <w:t xml:space="preserve"> can be stated as follows.</w:t>
-      </w:r>
-    </w:p>
-    <w:p>
-      <w:pPr>
-        <w:pStyle w:val="a4"/>
-        <w:numPr>
-          <w:ilvl w:val="0"/>
-          <w:numId w:val="1"/>
-        </w:numPr>
-        <w:spacing w:after="80" w:line="288" w:lineRule="auto"/>
-        <w:jc w:val="both"/>
-      </w:pPr>
-      <w:r>
-        <w:rPr>
-          <w:b/>
-          <w:bCs/>
-        </w:rPr>
-        <w:t>Gap 1 (consent representation).</w:t>
-      </w:r>
-      <w:r>
-        <w:t xml:space="preserve"> Existing approaches tend to treat consent primarily as a record of a patient’s permission, and the evaluable consent objects reported carry only a subset of the conditions and are issued by a single party.</w:t>
-      </w:r>
-    </w:p>
-    <w:p>
-      <w:pPr>
-        <w:pStyle w:val="a4"/>
-        <w:numPr>
-          <w:ilvl w:val="0"/>
-          <w:numId w:val="1"/>
-        </w:numPr>
-        <w:spacing w:after="80" w:line="288" w:lineRule="auto"/>
-        <w:jc w:val="both"/>
-      </w:pPr>
-      <w:r>
-        <w:rPr>
-          <w:b/>
-          <w:bCs/>
-        </w:rPr>
-        <w:t>Gap 2 (identity and authority).</w:t>
-      </w:r>
-      <w:r>
-        <w:t xml:space="preserve"> A valid decentralised identity can establish who a participant is, but it does not necessarily establish what that participant is authorised to do, and authority is verified separately from authentication in only 10 of the 25 studies.</w:t>
-      </w:r>
-    </w:p>
-    <w:p>
-      <w:pPr>
-        <w:pStyle w:val="a4"/>
-        <w:numPr>
-          <w:ilvl w:val="0"/>
-          <w:numId w:val="1"/>
-        </w:numPr>
-        <w:spacing w:after="80" w:line="288" w:lineRule="auto"/>
-        <w:jc w:val="both"/>
-      </w:pPr>
-      <w:r>
-        <w:rPr>
-          <w:b/>
-          <w:bCs/>
-        </w:rPr>
-        <w:t>Gap 3 (multi-party authorisation).</w:t>
-      </w:r>
-      <w:r>
-        <w:t xml:space="preserve"> Multi-party approval appears as a contingency path, an admission gate, or a registration-time co-consent, but not as a standing condition of every access decision with an approving set defined by the patient.</w:t>
-      </w:r>
-    </w:p>
-    <w:p>
-      <w:pPr>
-        <w:pStyle w:val="a4"/>
-        <w:numPr>
-          <w:ilvl w:val="0"/>
-          <w:numId w:val="1"/>
-        </w:numPr>
-        <w:spacing w:after="80" w:line="288" w:lineRule="auto"/>
-        <w:jc w:val="both"/>
-      </w:pPr>
-      <w:r>
-        <w:rPr>
-          <w:b/>
-          <w:bCs/>
-        </w:rPr>
-        <w:t>Gap 4 (policy and context).</w:t>
-      </w:r>
-      <w:r>
-        <w:t xml:space="preserve"> Purpose and data-scope constraints are rarely bound to the same access decision as identity, authority, and multi-party approval.</w:t>
-      </w:r>
-    </w:p>
-    <w:p>
-      <w:pPr>
-        <w:pStyle w:val="a4"/>
-        <w:numPr>
-          <w:ilvl w:val="0"/>
-          <w:numId w:val="1"/>
-        </w:numPr>
-        <w:spacing w:after="80" w:line="288" w:lineRule="auto"/>
-        <w:jc w:val="both"/>
-      </w:pPr>
-      <w:r>
-        <w:rPr>
-          <w:b/>
-          <w:bCs/>
-        </w:rPr>
-        <w:t>Gap 5 (temporal and lifecycle trust).</w:t>
-      </w:r>
-      <w:r>
-        <w:t xml:space="preserve"> Temporal validity, lifecycle state, and revocation are often enforced on a credential or at registration rather than evaluated at the time of each access request.</w:t>
-      </w:r>
-    </w:p>
-    <w:p>
-      <w:pPr>
-        <w:pStyle w:val="a4"/>
-        <w:numPr>
-          <w:ilvl w:val="0"/>
-          <w:numId w:val="1"/>
-        </w:numPr>
-        <w:spacing w:after="80" w:line="288" w:lineRule="auto"/>
-        <w:jc w:val="both"/>
-      </w:pPr>
-      <w:r>
-        <w:rPr>
-          <w:b/>
-          <w:bCs/>
-        </w:rPr>
-        <w:t>Gap 6 (security assurance).</w:t>
-      </w:r>
-      <w:r>
-        <w:t xml:space="preserve"> The authorisation decision as a whole is neither formally proved nor systematically tested, and any proof covers only a fragment of the predicate.</w:t>
-      </w:r>
-    </w:p>
-    <w:p>
-      <w:pPr>
-        <w:spacing w:after="110" w:line="264" w:lineRule="auto"/>
-        <w:jc w:val="both"/>
-      </w:pPr>
-      <w:r>
-        <w:t>Gap 1 to Gap 5 together form the conjunction gap, whereas Gap 6 corresponds to the assurance gap, and each gap is addressed by the research question and objective of the same number.</w:t>
+      <w:pPr/>
+      <w:r>
+        <w:t>The systematic literature review indicates that substantial research has been conducted on individual mechanisms for securing healthcare data sharing, including blockchain-based consent management, decentralised identity, verifiable credentials, cryptographic access control, policy-based authorisation, and multi-party approval. These approaches have demonstrated the value of decentralisation, tamper-resistant records, verifiable identity, fine-grained access control, and distributed decision-making in addressing different aspects of healthcare data security. However, the literature also reveals a significant conceptual and architectural fragmentation among these mechanisms. They are commonly investigated as independent technical solutions rather than as coordinated components of a unified trust-oriented authorisation model.</w:t>
+      </w:r>
+    </w:p>
+    <w:p>
+      <w:pPr/>
+      <w:r>
+        <w:t>The central gap is therefore not the absence of technologies for recording consent, verifying identity, or restricting data access. Rather, it is the absence of a sufficiently integrated model explaining how these mechanisms collectively establish a trustworthy authorisation decision. In particular, existing consent-oriented approaches tend to treat consent primarily as a record of a patient’s permission. Once the permission has been created and stored, subsequent access control may depend predominantly on the existence of the consent record and the successful authentication of the requester. Such a model establishes evidence that a consent decision occurred, but it does not necessarily establish that the requester possesses the required authority, that all required parties have independently approved the access, or that the requested operation is consistent with the purpose and data scope originally authorised by the patient.</w:t>
+      </w:r>
+    </w:p>
+    <w:p>
+      <w:pPr/>
+      <w:r>
+        <w:t>This distinction is important because recording consent and enforcing trustworthy authorisation represent fundamentally different security problems. A blockchain may provide an immutable representation of a consent event, but immutability does not establish the legitimacy of the entities involved in that event. Similarly, a valid decentralised identity can establish who a participant is, but it does not necessarily establish what that participant is authorised to do. Multi-party approval can strengthen collective decision-making, but approval alone does not guarantee that the resulting access request conforms to the patient’s authorised purpose or data scope. Consequently, trust cannot be attributed to any individual mechanism in isolation.</w:t>
+      </w:r>
+    </w:p>
+    <w:p>
+      <w:pPr/>
+      <w:r>
+        <w:t>From a Trust Computing perspective, this leads to a more fundamental research problem. Trustworthy access should be understood as an outcome of the coordinated satisfaction of multiple independently verifiable conditions. The relevant conditions include the legitimacy of the participating identities, the authority associated with those identities, the satisfaction of required collective approval conditions, and compliance between the requested operation and the policy defined by the consent. The research therefore conceptualises trust not as a static attribute possessed by a particular entity or technology, but as an emergent property of a verifiable authorisation process.</w:t>
+      </w:r>
+    </w:p>
+    <w:p>
+      <w:pPr/>
+      <w:r>
+        <w:t>This perspective also introduces an important distinction between authentication, authorisation, and trustworthy access. Authentication determines whether an entity can be identified and verified. Authorisation determines whether the entity is permitted to perform a particular operation. Trustworthy access requires an additional consideration: whether the authorisation decision itself has been established through sufficient, verifiable, and policy-compliant conditions. The research consequently investigates how these layers can be connected within a single framework without reducing trust to any individual credential, transaction, or access-control rule.</w:t>
+      </w:r>
+    </w:p>
+    <w:p>
+      <w:pPr/>
+      <w:r>
+        <w:t>The identified gap can therefore be stated as follows: existing healthcare consent and access-control research provides many of the necessary technological building blocks, but there remains a need for an integrated Trust Computing framework that treats patient consent as a security-bearing and evaluable authorisation object. Such a framework should be capable of representing the relevant trust conditions, verifying the participating entities and their authority, establishing collective authorisation where required, and enforcing the policy and data-scope constraints associated with the consent. The research addresses this gap by developing a trust-oriented authorisation model in which consent is not simply evidence that permission was granted, but the basis for evaluating whether a particular access request should be trusted. The resulting research direction places Trust Computing at the centre of the investigation, while treating blockchain, decentralised identity, verifiable credentials, and policy mechanisms as enabling technologies supporting the broader trust model.</w:t>
       </w:r>
     </w:p>
     <w:p>

</xml_diff>

<commit_message>
Thesis Chapter 5 review fixes: thesis wording, guardian requirement, resource categories, T and L sentence, duplicate roadmap removed
Co-Authored-By: Claude Fable 5.1 <noreply@anthropic.com>
Claude-Session: https://claude.ai/code/session_01QHSSv245Aernyaebt7V5kS
</commit_message>
<xml_diff>
--- a/docs/Yasir_Thesis_Chapter3.docx
+++ b/docs/Yasir_Thesis_Chapter3.docx
@@ -310,7 +310,16 @@
         <w:jc w:val="both"/>
       </w:pPr>
       <w:r>
-        <w:t>The research objectives are operationalised through six corresponding sub-research questions. Each sub-research question addresses a distinct dimension of the proposed trust-oriented healthcare authorisation framework. For brevity, SRQ1 to SRQ6 are referred to as RQ1 to RQ6 throughout this report.</w:t>
+        <w:t xml:space="preserve">The research objectives are operationalised through six corresponding sub-research questions. Each sub-research question addresses a distinct dimension of the proposed trust-oriented healthcare authorisation framework. For brevity, SRQ1 to SRQ6 are referred to as RQ1 to RQ6 </w:t>
+      </w:r>
+      <w:r>
+        <w:rPr>
+          <w:color w:val="FF0000"/>
+        </w:rPr>
+        <w:t>throughout this thesis</w:t>
+      </w:r>
+      <w:r>
+        <w:t>.</w:t>
       </w:r>
     </w:p>
     <w:p>

</xml_diff>

<commit_message>
Thesis Chapters 3-5: jurisdiction wording removed; VL is the lifecycle check throughout
Co-Authored-By: Claude Fable 5.1 <noreply@anthropic.com>
Claude-Session: https://claude.ai/code/session_01QHSSv245Aernyaebt7V5kS
</commit_message>
<xml_diff>
--- a/docs/Yasir_Thesis_Chapter3.docx
+++ b/docs/Yasir_Thesis_Chapter3.docx
@@ -636,44 +636,16 @@
         <w:jc w:val="both"/>
       </w:pPr>
       <w:r>
-        <w:lastRenderedPageBreak/>
-        <w:t>A valid authorisation decision requires the simultaneous satisfaction of all relevant trust conditions. Consequently, failure of any individual condition results in denial. In the prototype, an ALLOW decision additionally requires the exploratory jurisdiction check V</w:t>
-      </w:r>
-      <w:r>
-        <w:rPr>
-          <w:vertAlign w:val="subscript"/>
-        </w:rPr>
-        <w:t>J</w:t>
-      </w:r>
-      <w:r>
-        <w:t xml:space="preserve"> </w:t>
+        <w:t xml:space="preserve">A valid authorisation decision requires the simultaneous satisfaction of all relevant trust conditions. Consequently, failure of any individual condition results in denial. In the prototype, an ALLOW decision additionally </w:t>
       </w:r>
       <w:r>
         <w:rPr>
           <w:color w:val="FF0000"/>
         </w:rPr>
-        <w:t>(Chapter 8)</w:t>
-      </w:r>
-      <w:r>
-        <w:t xml:space="preserve"> to pass and the Groth16 ZK proof (Groth 2016) to verify, so a request that satisfies the five predicates is still denied when either fails, as in Scenario 4 </w:t>
-      </w:r>
-      <w:r>
-        <w:rPr>
-          <w:color w:val="FF0000"/>
-        </w:rPr>
-        <w:t>(Chapter 10)</w:t>
-      </w:r>
-      <w:r>
-        <w:t xml:space="preserve"> and attack A9 </w:t>
-      </w:r>
-      <w:r>
-        <w:rPr>
-          <w:color w:val="FF0000"/>
-        </w:rPr>
-        <w:t>(Chapter 10)</w:t>
-      </w:r>
-      <w:r>
-        <w:t>. Formal security assurance does not constitute another authorisation condition to be evaluated at runtime. Instead, it provides a means of specifying, analysing, and verifying the security properties of the integrated authorisation mechanism. Thus, RQ6 operates as an assurance layer over the mechanisms established by RQ1–RQ5.</w:t>
+        <w:t>requires the Groth16 ZK proof (Groth 2016) to verify, so a request that satisfies the five predicates is still denied when the proof fails, as in attack A9 (Chapter 10).</w:t>
+      </w:r>
+      <w:r>
+        <w:t xml:space="preserve"> Formal security assurance does not constitute another authorisation condition to be evaluated at runtime. Instead, it provides a means of specifying, analysing, and verifying the security properties of the integrated authorisation mechanism. Thus, RQ6 operates as an assurance layer over the mechanisms established by RQ1–RQ5.</w:t>
       </w:r>
     </w:p>
     <w:p>
@@ -817,16 +789,16 @@
         <w:jc w:val="both"/>
       </w:pPr>
       <w:r>
-        <w:t xml:space="preserve">The sixth research objective is to formally analyse and empirically evaluate whether the implemented framework satisfies its defined trust and authorisation properties under representative healthcare data-sharing scenarios. RO6 addresses RQ6 and combines formal security assurance with empirical validation of the proposed framework. The prototype must execute valid consent workflows, and it must also behave correctly when one or more trust conditions are violated. RO6 is partially completed through the implementation and initial scenario-based validation of the HALAH prototype. In particular, 46 automated tests cover signature rejection, proof tampering, credential checks, and twelve attack scenarios, A1 to A12, against the components of C and the contract. All twelve attacks are refused. Preliminary measurements of on-chain cost, confirmation latency, and processing time have been obtained, and a live out-of-jurisdiction request against a consent anchored on the deployed Sepolia contract was refused by the exploratory jurisdiction check of the application </w:t>
+        <w:t>The sixth research objective is to formally analyse and empirically evaluate whether the implemented framework satisfies its defined trust and authorisation properties under representative healthcare data-sharing scenarios. RO6 addresses RQ6 and combines formal security assurance with empirical validation of the proposed framework. The prototype must execute valid consent workflows, and it must also behave correctly when one or more trust conditions are violated. RO6 is partially completed through the implementation and initial scenario-based validation of the HALAH prototype. In particular, 46 automated tests cover signature rejection, proof tampering, credential checks, and twelve attack scenarios, A1 to A12, against the components of C and the contract. All twelve attacks are refused. Preliminary measurements of on-chain cost, confirmation latency, and processing time have been obtained</w:t>
       </w:r>
       <w:r>
         <w:rPr>
           <w:color w:val="FF0000"/>
         </w:rPr>
-        <w:t>(Chapter 8)</w:t>
-      </w:r>
-      <w:r>
-        <w:t>. The formal component will specify and analyse the security properties, consistency requirements, and soundness conditions of the trust-oriented authorisation mechanism. Although preliminary implementation and scenario-based testing support the current stage findings, the complete formal analysis, through proofs or model checking, and a larger evaluation under load will be conducted as part of next stage works.</w:t>
+        <w:t>.</w:t>
+      </w:r>
+      <w:r>
+        <w:t xml:space="preserve"> The formal component will specify and analyse the security properties, consistency requirements, and soundness conditions of the trust-oriented authorisation mechanism. Although preliminary implementation and scenario-based testing support the current stage findings, the complete formal analysis, through proofs or model checking, and a larger evaluation under load will be conducted as part of next stage works.</w:t>
       </w:r>
     </w:p>
     <w:p>

</xml_diff>

<commit_message>
Thesis tables: larger cell text, padding, light row rules; short tables kept on one page
Co-Authored-By: Claude Fable 5.1 <noreply@anthropic.com>
Claude-Session: https://claude.ai/code/session_01QHSSv245Aernyaebt7V5kS
</commit_message>
<xml_diff>
--- a/docs/Yasir_Thesis_Chapter3.docx
+++ b/docs/Yasir_Thesis_Chapter3.docx
@@ -919,8 +919,10 @@
           <w:insideV w:val="nil"/>
         </w:tblBorders>
         <w:tblCellMar>
-          <w:left w:w="10" w:type="dxa"/>
-          <w:right w:w="10" w:type="dxa"/>
+          <w:top w:w="50" w:type="dxa"/>
+          <w:left w:w="70" w:type="dxa"/>
+          <w:bottom w:w="50" w:type="dxa"/>
+          <w:right w:w="70" w:type="dxa"/>
         </w:tblCellMar>
         <w:tblLook w:val="0000" w:firstRow="0" w:lastRow="0" w:firstColumn="0" w:lastColumn="0" w:noHBand="0" w:noVBand="0"/>
       </w:tblPr>
@@ -952,11 +954,12 @@
               <w:bottom w:w="40" w:type="dxa"/>
               <w:right w:w="80" w:type="dxa"/>
             </w:tcMar>
+            <w:vAlign w:val="top"/>
           </w:tcPr>
           <w:p>
             <w:pPr>
               <w:keepNext/>
-              <w:spacing w:after="40" w:line="240" w:lineRule="auto"/>
+              <w:spacing w:before="40" w:after="40" w:line="240" w:lineRule="auto"/>
               <w:jc w:val="left"/>
             </w:pPr>
             <w:r>
@@ -965,7 +968,7 @@
                 <w:b/>
                 <w:bCs/>
                 <w:color w:val="000000"/>
-                <w:sz w:val="19"/>
+                <w:sz w:val="20"/>
                 <w:szCs w:val="17"/>
               </w:rPr>
               <w:t>RQ</w:t>
@@ -989,11 +992,12 @@
               <w:bottom w:w="40" w:type="dxa"/>
               <w:right w:w="80" w:type="dxa"/>
             </w:tcMar>
+            <w:vAlign w:val="top"/>
           </w:tcPr>
           <w:p>
             <w:pPr>
               <w:keepNext/>
-              <w:spacing w:after="40" w:line="240" w:lineRule="auto"/>
+              <w:spacing w:before="40" w:after="40" w:line="240" w:lineRule="auto"/>
               <w:jc w:val="left"/>
             </w:pPr>
             <w:r>
@@ -1002,7 +1006,7 @@
                 <w:b/>
                 <w:bCs/>
                 <w:color w:val="000000"/>
-                <w:sz w:val="19"/>
+                <w:sz w:val="20"/>
                 <w:szCs w:val="17"/>
               </w:rPr>
               <w:t>Research objective</w:t>
@@ -1026,11 +1030,12 @@
               <w:bottom w:w="40" w:type="dxa"/>
               <w:right w:w="80" w:type="dxa"/>
             </w:tcMar>
+            <w:vAlign w:val="top"/>
           </w:tcPr>
           <w:p>
             <w:pPr>
               <w:keepNext/>
-              <w:spacing w:after="40" w:line="240" w:lineRule="auto"/>
+              <w:spacing w:before="40" w:after="40" w:line="240" w:lineRule="auto"/>
               <w:jc w:val="left"/>
             </w:pPr>
             <w:r>
@@ -1039,7 +1044,7 @@
                 <w:b/>
                 <w:bCs/>
                 <w:color w:val="000000"/>
-                <w:sz w:val="19"/>
+                <w:sz w:val="20"/>
                 <w:szCs w:val="17"/>
               </w:rPr>
               <w:t>Description</w:t>
@@ -1063,11 +1068,12 @@
               <w:bottom w:w="40" w:type="dxa"/>
               <w:right w:w="80" w:type="dxa"/>
             </w:tcMar>
+            <w:vAlign w:val="top"/>
           </w:tcPr>
           <w:p>
             <w:pPr>
               <w:keepNext/>
-              <w:spacing w:after="40" w:line="240" w:lineRule="auto"/>
+              <w:spacing w:before="40" w:after="40" w:line="240" w:lineRule="auto"/>
               <w:jc w:val="left"/>
             </w:pPr>
             <w:r>
@@ -1076,7 +1082,7 @@
                 <w:b/>
                 <w:bCs/>
                 <w:color w:val="000000"/>
-                <w:sz w:val="19"/>
+                <w:sz w:val="20"/>
                 <w:szCs w:val="17"/>
               </w:rPr>
               <w:t>Status</w:t>
@@ -1094,7 +1100,7 @@
             <w:tcBorders>
               <w:top w:val="nil"/>
               <w:left w:val="nil"/>
-              <w:bottom w:val="nil"/>
+              <w:bottom w:val="single" w:sz="4" w:color="BFBFBF" w:space="0"/>
               <w:right w:val="nil"/>
               <w:insideH w:val="nil"/>
               <w:insideV w:val="nil"/>
@@ -1105,18 +1111,19 @@
               <w:bottom w:w="40" w:type="dxa"/>
               <w:right w:w="80" w:type="dxa"/>
             </w:tcMar>
+            <w:vAlign w:val="top"/>
           </w:tcPr>
           <w:p>
             <w:pPr>
               <w:keepNext/>
-              <w:spacing w:after="40" w:line="240" w:lineRule="auto"/>
+              <w:spacing w:before="40" w:after="40" w:line="240" w:lineRule="auto"/>
               <w:jc w:val="left"/>
             </w:pPr>
             <w:r>
               <w:rPr>
                 <w:rFonts w:ascii="Palatino Linotype" w:hAnsi="Palatino Linotype" w:cs="Palatino Linotype"/>
                 <w:color w:val="000000"/>
-                <w:sz w:val="19"/>
+                <w:sz w:val="20"/>
                 <w:szCs w:val="17"/>
               </w:rPr>
               <w:t>RQ1</w:t>
@@ -1129,7 +1136,7 @@
             <w:tcBorders>
               <w:top w:val="nil"/>
               <w:left w:val="nil"/>
-              <w:bottom w:val="nil"/>
+              <w:bottom w:val="single" w:sz="4" w:color="BFBFBF" w:space="0"/>
               <w:right w:val="nil"/>
               <w:insideH w:val="nil"/>
               <w:insideV w:val="nil"/>
@@ -1140,18 +1147,19 @@
               <w:bottom w:w="40" w:type="dxa"/>
               <w:right w:w="80" w:type="dxa"/>
             </w:tcMar>
+            <w:vAlign w:val="top"/>
           </w:tcPr>
           <w:p>
             <w:pPr>
               <w:keepNext/>
-              <w:spacing w:after="40" w:line="240" w:lineRule="auto"/>
+              <w:spacing w:before="40" w:after="40" w:line="240" w:lineRule="auto"/>
               <w:jc w:val="left"/>
             </w:pPr>
             <w:r>
               <w:rPr>
                 <w:rFonts w:ascii="Palatino Linotype" w:hAnsi="Palatino Linotype" w:cs="Palatino Linotype"/>
                 <w:color w:val="000000"/>
-                <w:sz w:val="19"/>
+                <w:sz w:val="20"/>
                 <w:szCs w:val="17"/>
               </w:rPr>
               <w:t>RO1: Trust-Centric Consent Model</w:t>
@@ -1164,7 +1172,7 @@
             <w:tcBorders>
               <w:top w:val="nil"/>
               <w:left w:val="nil"/>
-              <w:bottom w:val="nil"/>
+              <w:bottom w:val="single" w:sz="4" w:color="BFBFBF" w:space="0"/>
               <w:right w:val="nil"/>
               <w:insideH w:val="nil"/>
               <w:insideV w:val="nil"/>
@@ -1175,18 +1183,19 @@
               <w:bottom w:w="40" w:type="dxa"/>
               <w:right w:w="80" w:type="dxa"/>
             </w:tcMar>
+            <w:vAlign w:val="top"/>
           </w:tcPr>
           <w:p>
             <w:pPr>
               <w:keepNext/>
-              <w:spacing w:after="40" w:line="240" w:lineRule="auto"/>
+              <w:spacing w:before="40" w:after="40" w:line="240" w:lineRule="auto"/>
               <w:jc w:val="left"/>
             </w:pPr>
             <w:r>
               <w:rPr>
                 <w:rFonts w:ascii="Palatino Linotype" w:hAnsi="Palatino Linotype" w:cs="Palatino Linotype"/>
                 <w:color w:val="000000"/>
-                <w:sz w:val="19"/>
+                <w:sz w:val="20"/>
                 <w:szCs w:val="17"/>
               </w:rPr>
               <w:t>To develop a trust-aware consent model that represents patient consent as a structured and evaluable authorisation object.</w:t>
@@ -1199,7 +1208,7 @@
             <w:tcBorders>
               <w:top w:val="nil"/>
               <w:left w:val="nil"/>
-              <w:bottom w:val="nil"/>
+              <w:bottom w:val="single" w:sz="4" w:color="BFBFBF" w:space="0"/>
               <w:right w:val="nil"/>
               <w:insideH w:val="nil"/>
               <w:insideV w:val="nil"/>
@@ -1210,18 +1219,19 @@
               <w:bottom w:w="40" w:type="dxa"/>
               <w:right w:w="80" w:type="dxa"/>
             </w:tcMar>
+            <w:vAlign w:val="top"/>
           </w:tcPr>
           <w:p>
             <w:pPr>
               <w:keepNext/>
-              <w:spacing w:after="40" w:line="240" w:lineRule="auto"/>
+              <w:spacing w:before="40" w:after="40" w:line="240" w:lineRule="auto"/>
               <w:jc w:val="left"/>
             </w:pPr>
             <w:r>
               <w:rPr>
                 <w:rFonts w:ascii="Palatino Linotype" w:hAnsi="Palatino Linotype" w:cs="Palatino Linotype"/>
                 <w:color w:val="000000"/>
-                <w:sz w:val="19"/>
+                <w:sz w:val="20"/>
                 <w:szCs w:val="17"/>
               </w:rPr>
               <w:t>Done</w:t>
@@ -1239,7 +1249,7 @@
             <w:tcBorders>
               <w:top w:val="nil"/>
               <w:left w:val="nil"/>
-              <w:bottom w:val="nil"/>
+              <w:bottom w:val="single" w:sz="4" w:color="BFBFBF" w:space="0"/>
               <w:right w:val="nil"/>
               <w:insideH w:val="nil"/>
               <w:insideV w:val="nil"/>
@@ -1250,18 +1260,19 @@
               <w:bottom w:w="40" w:type="dxa"/>
               <w:right w:w="80" w:type="dxa"/>
             </w:tcMar>
+            <w:vAlign w:val="top"/>
           </w:tcPr>
           <w:p>
             <w:pPr>
               <w:keepNext/>
-              <w:spacing w:after="40" w:line="240" w:lineRule="auto"/>
+              <w:spacing w:before="40" w:after="40" w:line="240" w:lineRule="auto"/>
               <w:jc w:val="left"/>
             </w:pPr>
             <w:r>
               <w:rPr>
                 <w:rFonts w:ascii="Palatino Linotype" w:hAnsi="Palatino Linotype" w:cs="Palatino Linotype"/>
                 <w:color w:val="000000"/>
-                <w:sz w:val="19"/>
+                <w:sz w:val="20"/>
                 <w:szCs w:val="17"/>
               </w:rPr>
               <w:t>RQ2</w:t>
@@ -1274,7 +1285,7 @@
             <w:tcBorders>
               <w:top w:val="nil"/>
               <w:left w:val="nil"/>
-              <w:bottom w:val="nil"/>
+              <w:bottom w:val="single" w:sz="4" w:color="BFBFBF" w:space="0"/>
               <w:right w:val="nil"/>
               <w:insideH w:val="nil"/>
               <w:insideV w:val="nil"/>
@@ -1285,18 +1296,19 @@
               <w:bottom w:w="40" w:type="dxa"/>
               <w:right w:w="80" w:type="dxa"/>
             </w:tcMar>
+            <w:vAlign w:val="top"/>
           </w:tcPr>
           <w:p>
             <w:pPr>
               <w:keepNext/>
-              <w:spacing w:after="40" w:line="240" w:lineRule="auto"/>
+              <w:spacing w:before="40" w:after="40" w:line="240" w:lineRule="auto"/>
               <w:jc w:val="left"/>
             </w:pPr>
             <w:r>
               <w:rPr>
                 <w:rFonts w:ascii="Palatino Linotype" w:hAnsi="Palatino Linotype" w:cs="Palatino Linotype"/>
                 <w:color w:val="000000"/>
-                <w:sz w:val="19"/>
+                <w:sz w:val="20"/>
                 <w:szCs w:val="17"/>
               </w:rPr>
               <w:t>RO2: Decentralised Identity and Authority Trust</w:t>
@@ -1309,7 +1321,7 @@
             <w:tcBorders>
               <w:top w:val="nil"/>
               <w:left w:val="nil"/>
-              <w:bottom w:val="nil"/>
+              <w:bottom w:val="single" w:sz="4" w:color="BFBFBF" w:space="0"/>
               <w:right w:val="nil"/>
               <w:insideH w:val="nil"/>
               <w:insideV w:val="nil"/>
@@ -1320,18 +1332,19 @@
               <w:bottom w:w="40" w:type="dxa"/>
               <w:right w:w="80" w:type="dxa"/>
             </w:tcMar>
+            <w:vAlign w:val="top"/>
           </w:tcPr>
           <w:p>
             <w:pPr>
               <w:keepNext/>
-              <w:spacing w:after="40" w:line="240" w:lineRule="auto"/>
+              <w:spacing w:before="40" w:after="40" w:line="240" w:lineRule="auto"/>
               <w:jc w:val="left"/>
             </w:pPr>
             <w:r>
               <w:rPr>
                 <w:rFonts w:ascii="Palatino Linotype" w:hAnsi="Palatino Linotype" w:cs="Palatino Linotype"/>
                 <w:color w:val="000000"/>
-                <w:sz w:val="19"/>
+                <w:sz w:val="20"/>
                 <w:szCs w:val="17"/>
               </w:rPr>
               <w:t>To develop a decentralised identity and authority verification mechanism using decentralised identifiers and verifiable credentials.</w:t>
@@ -1344,7 +1357,7 @@
             <w:tcBorders>
               <w:top w:val="nil"/>
               <w:left w:val="nil"/>
-              <w:bottom w:val="nil"/>
+              <w:bottom w:val="single" w:sz="4" w:color="BFBFBF" w:space="0"/>
               <w:right w:val="nil"/>
               <w:insideH w:val="nil"/>
               <w:insideV w:val="nil"/>
@@ -1355,18 +1368,19 @@
               <w:bottom w:w="40" w:type="dxa"/>
               <w:right w:w="80" w:type="dxa"/>
             </w:tcMar>
+            <w:vAlign w:val="top"/>
           </w:tcPr>
           <w:p>
             <w:pPr>
               <w:keepNext/>
-              <w:spacing w:after="40" w:line="240" w:lineRule="auto"/>
+              <w:spacing w:before="40" w:after="40" w:line="240" w:lineRule="auto"/>
               <w:jc w:val="left"/>
             </w:pPr>
             <w:r>
               <w:rPr>
                 <w:rFonts w:ascii="Palatino Linotype" w:hAnsi="Palatino Linotype" w:cs="Palatino Linotype"/>
                 <w:color w:val="000000"/>
-                <w:sz w:val="19"/>
+                <w:sz w:val="20"/>
                 <w:szCs w:val="17"/>
               </w:rPr>
               <w:t>Done</w:t>
@@ -1384,7 +1398,7 @@
             <w:tcBorders>
               <w:top w:val="nil"/>
               <w:left w:val="nil"/>
-              <w:bottom w:val="nil"/>
+              <w:bottom w:val="single" w:sz="4" w:color="BFBFBF" w:space="0"/>
               <w:right w:val="nil"/>
               <w:insideH w:val="nil"/>
               <w:insideV w:val="nil"/>
@@ -1395,18 +1409,19 @@
               <w:bottom w:w="40" w:type="dxa"/>
               <w:right w:w="80" w:type="dxa"/>
             </w:tcMar>
+            <w:vAlign w:val="top"/>
           </w:tcPr>
           <w:p>
             <w:pPr>
               <w:keepNext/>
-              <w:spacing w:after="40" w:line="240" w:lineRule="auto"/>
+              <w:spacing w:before="40" w:after="40" w:line="240" w:lineRule="auto"/>
               <w:jc w:val="left"/>
             </w:pPr>
             <w:r>
               <w:rPr>
                 <w:rFonts w:ascii="Palatino Linotype" w:hAnsi="Palatino Linotype" w:cs="Palatino Linotype"/>
                 <w:color w:val="000000"/>
-                <w:sz w:val="19"/>
+                <w:sz w:val="20"/>
                 <w:szCs w:val="17"/>
               </w:rPr>
               <w:t>RQ3</w:t>
@@ -1419,7 +1434,7 @@
             <w:tcBorders>
               <w:top w:val="nil"/>
               <w:left w:val="nil"/>
-              <w:bottom w:val="nil"/>
+              <w:bottom w:val="single" w:sz="4" w:color="BFBFBF" w:space="0"/>
               <w:right w:val="nil"/>
               <w:insideH w:val="nil"/>
               <w:insideV w:val="nil"/>
@@ -1430,18 +1445,19 @@
               <w:bottom w:w="40" w:type="dxa"/>
               <w:right w:w="80" w:type="dxa"/>
             </w:tcMar>
+            <w:vAlign w:val="top"/>
           </w:tcPr>
           <w:p>
             <w:pPr>
               <w:keepNext/>
-              <w:spacing w:after="40" w:line="240" w:lineRule="auto"/>
+              <w:spacing w:before="40" w:after="40" w:line="240" w:lineRule="auto"/>
               <w:jc w:val="left"/>
             </w:pPr>
             <w:r>
               <w:rPr>
                 <w:rFonts w:ascii="Palatino Linotype" w:hAnsi="Palatino Linotype" w:cs="Palatino Linotype"/>
                 <w:color w:val="000000"/>
-                <w:sz w:val="19"/>
+                <w:sz w:val="20"/>
                 <w:szCs w:val="17"/>
               </w:rPr>
               <w:t>RO3: Trustworthy Multi-Party Authorisation</w:t>
@@ -1454,7 +1470,7 @@
             <w:tcBorders>
               <w:top w:val="nil"/>
               <w:left w:val="nil"/>
-              <w:bottom w:val="nil"/>
+              <w:bottom w:val="single" w:sz="4" w:color="BFBFBF" w:space="0"/>
               <w:right w:val="nil"/>
               <w:insideH w:val="nil"/>
               <w:insideV w:val="nil"/>
@@ -1465,18 +1481,19 @@
               <w:bottom w:w="40" w:type="dxa"/>
               <w:right w:w="80" w:type="dxa"/>
             </w:tcMar>
+            <w:vAlign w:val="top"/>
           </w:tcPr>
           <w:p>
             <w:pPr>
               <w:keepNext/>
-              <w:spacing w:after="40" w:line="240" w:lineRule="auto"/>
+              <w:spacing w:before="40" w:after="40" w:line="240" w:lineRule="auto"/>
               <w:jc w:val="left"/>
             </w:pPr>
             <w:r>
               <w:rPr>
                 <w:rFonts w:ascii="Palatino Linotype" w:hAnsi="Palatino Linotype" w:cs="Palatino Linotype"/>
                 <w:color w:val="000000"/>
-                <w:sz w:val="19"/>
+                <w:sz w:val="20"/>
                 <w:szCs w:val="17"/>
               </w:rPr>
               <w:t>To develop a threshold-based multi-party authorisation mechanism through which multiple independently verified participants and guardians can jointly establish a trustworthy consent decision.</w:t>
@@ -1489,7 +1506,7 @@
             <w:tcBorders>
               <w:top w:val="nil"/>
               <w:left w:val="nil"/>
-              <w:bottom w:val="nil"/>
+              <w:bottom w:val="single" w:sz="4" w:color="BFBFBF" w:space="0"/>
               <w:right w:val="nil"/>
               <w:insideH w:val="nil"/>
               <w:insideV w:val="nil"/>
@@ -1500,18 +1517,19 @@
               <w:bottom w:w="40" w:type="dxa"/>
               <w:right w:w="80" w:type="dxa"/>
             </w:tcMar>
+            <w:vAlign w:val="top"/>
           </w:tcPr>
           <w:p>
             <w:pPr>
               <w:keepNext/>
-              <w:spacing w:after="40" w:line="240" w:lineRule="auto"/>
+              <w:spacing w:before="40" w:after="40" w:line="240" w:lineRule="auto"/>
               <w:jc w:val="left"/>
             </w:pPr>
             <w:r>
               <w:rPr>
                 <w:rFonts w:ascii="Palatino Linotype" w:hAnsi="Palatino Linotype" w:cs="Palatino Linotype"/>
                 <w:color w:val="000000"/>
-                <w:sz w:val="19"/>
+                <w:sz w:val="20"/>
                 <w:szCs w:val="17"/>
               </w:rPr>
               <w:t>Done</w:t>
@@ -1529,7 +1547,7 @@
             <w:tcBorders>
               <w:top w:val="nil"/>
               <w:left w:val="nil"/>
-              <w:bottom w:val="nil"/>
+              <w:bottom w:val="single" w:sz="4" w:color="BFBFBF" w:space="0"/>
               <w:right w:val="nil"/>
               <w:insideH w:val="nil"/>
               <w:insideV w:val="nil"/>
@@ -1540,18 +1558,19 @@
               <w:bottom w:w="40" w:type="dxa"/>
               <w:right w:w="80" w:type="dxa"/>
             </w:tcMar>
+            <w:vAlign w:val="top"/>
           </w:tcPr>
           <w:p>
             <w:pPr>
               <w:keepNext/>
-              <w:spacing w:after="40" w:line="240" w:lineRule="auto"/>
+              <w:spacing w:before="40" w:after="40" w:line="240" w:lineRule="auto"/>
               <w:jc w:val="left"/>
             </w:pPr>
             <w:r>
               <w:rPr>
                 <w:rFonts w:ascii="Palatino Linotype" w:hAnsi="Palatino Linotype" w:cs="Palatino Linotype"/>
                 <w:color w:val="000000"/>
-                <w:sz w:val="19"/>
+                <w:sz w:val="20"/>
                 <w:szCs w:val="17"/>
               </w:rPr>
               <w:t>RQ4</w:t>
@@ -1564,7 +1583,7 @@
             <w:tcBorders>
               <w:top w:val="nil"/>
               <w:left w:val="nil"/>
-              <w:bottom w:val="nil"/>
+              <w:bottom w:val="single" w:sz="4" w:color="BFBFBF" w:space="0"/>
               <w:right w:val="nil"/>
               <w:insideH w:val="nil"/>
               <w:insideV w:val="nil"/>
@@ -1575,18 +1594,19 @@
               <w:bottom w:w="40" w:type="dxa"/>
               <w:right w:w="80" w:type="dxa"/>
             </w:tcMar>
+            <w:vAlign w:val="top"/>
           </w:tcPr>
           <w:p>
             <w:pPr>
               <w:keepNext/>
-              <w:spacing w:after="40" w:line="240" w:lineRule="auto"/>
+              <w:spacing w:before="40" w:after="40" w:line="240" w:lineRule="auto"/>
               <w:jc w:val="left"/>
             </w:pPr>
             <w:r>
               <w:rPr>
                 <w:rFonts w:ascii="Palatino Linotype" w:hAnsi="Palatino Linotype" w:cs="Palatino Linotype"/>
                 <w:color w:val="000000"/>
-                <w:sz w:val="19"/>
+                <w:sz w:val="20"/>
                 <w:szCs w:val="17"/>
               </w:rPr>
               <w:t>RO4: Policy- and Context-Aware Access Control</w:t>
@@ -1599,7 +1619,7 @@
             <w:tcBorders>
               <w:top w:val="nil"/>
               <w:left w:val="nil"/>
-              <w:bottom w:val="nil"/>
+              <w:bottom w:val="single" w:sz="4" w:color="BFBFBF" w:space="0"/>
               <w:right w:val="nil"/>
               <w:insideH w:val="nil"/>
               <w:insideV w:val="nil"/>
@@ -1610,18 +1630,19 @@
               <w:bottom w:w="40" w:type="dxa"/>
               <w:right w:w="80" w:type="dxa"/>
             </w:tcMar>
+            <w:vAlign w:val="top"/>
           </w:tcPr>
           <w:p>
             <w:pPr>
               <w:keepNext/>
-              <w:spacing w:after="40" w:line="240" w:lineRule="auto"/>
+              <w:spacing w:before="40" w:after="40" w:line="240" w:lineRule="auto"/>
               <w:jc w:val="left"/>
             </w:pPr>
             <w:r>
               <w:rPr>
                 <w:rFonts w:ascii="Palatino Linotype" w:hAnsi="Palatino Linotype" w:cs="Palatino Linotype"/>
                 <w:color w:val="000000"/>
-                <w:sz w:val="19"/>
+                <w:sz w:val="20"/>
                 <w:szCs w:val="17"/>
               </w:rPr>
               <w:t>To develop a policy-aware authorisation mechanism that evaluates the purpose and data scope of a requested operation against the constraints defined by the consent.</w:t>
@@ -1634,7 +1655,7 @@
             <w:tcBorders>
               <w:top w:val="nil"/>
               <w:left w:val="nil"/>
-              <w:bottom w:val="nil"/>
+              <w:bottom w:val="single" w:sz="4" w:color="BFBFBF" w:space="0"/>
               <w:right w:val="nil"/>
               <w:insideH w:val="nil"/>
               <w:insideV w:val="nil"/>
@@ -1645,18 +1666,19 @@
               <w:bottom w:w="40" w:type="dxa"/>
               <w:right w:w="80" w:type="dxa"/>
             </w:tcMar>
+            <w:vAlign w:val="top"/>
           </w:tcPr>
           <w:p>
             <w:pPr>
               <w:keepNext/>
-              <w:spacing w:after="40" w:line="240" w:lineRule="auto"/>
+              <w:spacing w:before="40" w:after="40" w:line="240" w:lineRule="auto"/>
               <w:jc w:val="left"/>
             </w:pPr>
             <w:r>
               <w:rPr>
                 <w:rFonts w:ascii="Palatino Linotype" w:hAnsi="Palatino Linotype" w:cs="Palatino Linotype"/>
                 <w:color w:val="000000"/>
-                <w:sz w:val="19"/>
+                <w:sz w:val="20"/>
                 <w:szCs w:val="17"/>
               </w:rPr>
               <w:t>Done</w:t>
@@ -1674,7 +1696,7 @@
             <w:tcBorders>
               <w:top w:val="nil"/>
               <w:left w:val="nil"/>
-              <w:bottom w:val="nil"/>
+              <w:bottom w:val="single" w:sz="4" w:color="BFBFBF" w:space="0"/>
               <w:right w:val="nil"/>
               <w:insideH w:val="nil"/>
               <w:insideV w:val="nil"/>
@@ -1685,18 +1707,19 @@
               <w:bottom w:w="40" w:type="dxa"/>
               <w:right w:w="80" w:type="dxa"/>
             </w:tcMar>
+            <w:vAlign w:val="top"/>
           </w:tcPr>
           <w:p>
             <w:pPr>
               <w:keepNext/>
-              <w:spacing w:after="40" w:line="240" w:lineRule="auto"/>
+              <w:spacing w:before="40" w:after="40" w:line="240" w:lineRule="auto"/>
               <w:jc w:val="left"/>
             </w:pPr>
             <w:r>
               <w:rPr>
                 <w:rFonts w:ascii="Palatino Linotype" w:hAnsi="Palatino Linotype" w:cs="Palatino Linotype"/>
                 <w:color w:val="000000"/>
-                <w:sz w:val="19"/>
+                <w:sz w:val="20"/>
                 <w:szCs w:val="17"/>
               </w:rPr>
               <w:t>RQ5</w:t>
@@ -1709,7 +1732,7 @@
             <w:tcBorders>
               <w:top w:val="nil"/>
               <w:left w:val="nil"/>
-              <w:bottom w:val="nil"/>
+              <w:bottom w:val="single" w:sz="4" w:color="BFBFBF" w:space="0"/>
               <w:right w:val="nil"/>
               <w:insideH w:val="nil"/>
               <w:insideV w:val="nil"/>
@@ -1720,18 +1743,19 @@
               <w:bottom w:w="40" w:type="dxa"/>
               <w:right w:w="80" w:type="dxa"/>
             </w:tcMar>
+            <w:vAlign w:val="top"/>
           </w:tcPr>
           <w:p>
             <w:pPr>
               <w:keepNext/>
-              <w:spacing w:after="40" w:line="240" w:lineRule="auto"/>
+              <w:spacing w:before="40" w:after="40" w:line="240" w:lineRule="auto"/>
               <w:jc w:val="left"/>
             </w:pPr>
             <w:r>
               <w:rPr>
                 <w:rFonts w:ascii="Palatino Linotype" w:hAnsi="Palatino Linotype" w:cs="Palatino Linotype"/>
                 <w:color w:val="000000"/>
-                <w:sz w:val="19"/>
+                <w:sz w:val="20"/>
                 <w:szCs w:val="17"/>
               </w:rPr>
               <w:t>RO5: Temporal and Lifecycle Trust</w:t>
@@ -1744,7 +1768,7 @@
             <w:tcBorders>
               <w:top w:val="nil"/>
               <w:left w:val="nil"/>
-              <w:bottom w:val="nil"/>
+              <w:bottom w:val="single" w:sz="4" w:color="BFBFBF" w:space="0"/>
               <w:right w:val="nil"/>
               <w:insideH w:val="nil"/>
               <w:insideV w:val="nil"/>
@@ -1755,18 +1779,19 @@
               <w:bottom w:w="40" w:type="dxa"/>
               <w:right w:w="80" w:type="dxa"/>
             </w:tcMar>
+            <w:vAlign w:val="top"/>
           </w:tcPr>
           <w:p>
             <w:pPr>
               <w:keepNext/>
-              <w:spacing w:after="40" w:line="240" w:lineRule="auto"/>
+              <w:spacing w:before="40" w:after="40" w:line="240" w:lineRule="auto"/>
               <w:jc w:val="left"/>
             </w:pPr>
             <w:r>
               <w:rPr>
                 <w:rFonts w:ascii="Palatino Linotype" w:hAnsi="Palatino Linotype" w:cs="Palatino Linotype"/>
                 <w:color w:val="000000"/>
-                <w:sz w:val="19"/>
+                <w:sz w:val="20"/>
                 <w:szCs w:val="17"/>
               </w:rPr>
               <w:t>To extend the trust-oriented framework with temporal validity and consent lifecycle controls.</w:t>
@@ -1779,7 +1804,7 @@
             <w:tcBorders>
               <w:top w:val="nil"/>
               <w:left w:val="nil"/>
-              <w:bottom w:val="nil"/>
+              <w:bottom w:val="single" w:sz="4" w:color="BFBFBF" w:space="0"/>
               <w:right w:val="nil"/>
               <w:insideH w:val="nil"/>
               <w:insideV w:val="nil"/>
@@ -1790,18 +1815,19 @@
               <w:bottom w:w="40" w:type="dxa"/>
               <w:right w:w="80" w:type="dxa"/>
             </w:tcMar>
+            <w:vAlign w:val="top"/>
           </w:tcPr>
           <w:p>
             <w:pPr>
               <w:keepNext/>
-              <w:spacing w:after="40" w:line="240" w:lineRule="auto"/>
+              <w:spacing w:before="40" w:after="40" w:line="240" w:lineRule="auto"/>
               <w:jc w:val="left"/>
             </w:pPr>
             <w:r>
               <w:rPr>
                 <w:rFonts w:ascii="Palatino Linotype" w:hAnsi="Palatino Linotype" w:cs="Palatino Linotype"/>
                 <w:color w:val="000000"/>
-                <w:sz w:val="19"/>
+                <w:sz w:val="20"/>
                 <w:szCs w:val="17"/>
               </w:rPr>
               <w:t>In Progress</w:t>
@@ -1830,17 +1856,18 @@
               <w:bottom w:w="40" w:type="dxa"/>
               <w:right w:w="80" w:type="dxa"/>
             </w:tcMar>
+            <w:vAlign w:val="top"/>
           </w:tcPr>
           <w:p>
             <w:pPr>
-              <w:spacing w:after="40" w:line="240" w:lineRule="auto"/>
+              <w:spacing w:before="40" w:after="40" w:line="240" w:lineRule="auto"/>
               <w:jc w:val="left"/>
             </w:pPr>
             <w:r>
               <w:rPr>
                 <w:rFonts w:ascii="Palatino Linotype" w:hAnsi="Palatino Linotype" w:cs="Palatino Linotype"/>
                 <w:color w:val="000000"/>
-                <w:sz w:val="19"/>
+                <w:sz w:val="20"/>
                 <w:szCs w:val="17"/>
               </w:rPr>
               <w:t>RQ6</w:t>
@@ -1864,17 +1891,18 @@
               <w:bottom w:w="40" w:type="dxa"/>
               <w:right w:w="80" w:type="dxa"/>
             </w:tcMar>
+            <w:vAlign w:val="top"/>
           </w:tcPr>
           <w:p>
             <w:pPr>
-              <w:spacing w:after="40" w:line="240" w:lineRule="auto"/>
+              <w:spacing w:before="40" w:after="40" w:line="240" w:lineRule="auto"/>
               <w:jc w:val="left"/>
             </w:pPr>
             <w:r>
               <w:rPr>
                 <w:rFonts w:ascii="Palatino Linotype" w:hAnsi="Palatino Linotype" w:cs="Palatino Linotype"/>
                 <w:color w:val="000000"/>
-                <w:sz w:val="19"/>
+                <w:sz w:val="20"/>
                 <w:szCs w:val="17"/>
               </w:rPr>
               <w:t>RO6: Formal Security Assurance and Empirical Validation</w:t>
@@ -1898,17 +1926,18 @@
               <w:bottom w:w="40" w:type="dxa"/>
               <w:right w:w="80" w:type="dxa"/>
             </w:tcMar>
+            <w:vAlign w:val="top"/>
           </w:tcPr>
           <w:p>
             <w:pPr>
-              <w:spacing w:after="40" w:line="240" w:lineRule="auto"/>
+              <w:spacing w:before="40" w:after="40" w:line="240" w:lineRule="auto"/>
               <w:jc w:val="left"/>
             </w:pPr>
             <w:r>
               <w:rPr>
                 <w:rFonts w:ascii="Palatino Linotype" w:hAnsi="Palatino Linotype" w:cs="Palatino Linotype"/>
                 <w:color w:val="000000"/>
-                <w:sz w:val="19"/>
+                <w:sz w:val="20"/>
                 <w:szCs w:val="17"/>
               </w:rPr>
               <w:t>To formally analyse and empirically evaluate whether the implemented framework satisfies its defined trust and authorisation properties under representative healthcare data-sharing scenarios.</w:t>
@@ -1932,17 +1961,18 @@
               <w:bottom w:w="40" w:type="dxa"/>
               <w:right w:w="80" w:type="dxa"/>
             </w:tcMar>
+            <w:vAlign w:val="top"/>
           </w:tcPr>
           <w:p>
             <w:pPr>
-              <w:spacing w:after="40" w:line="240" w:lineRule="auto"/>
+              <w:spacing w:before="40" w:after="40" w:line="240" w:lineRule="auto"/>
               <w:jc w:val="left"/>
             </w:pPr>
             <w:r>
               <w:rPr>
                 <w:rFonts w:ascii="Palatino Linotype" w:hAnsi="Palatino Linotype" w:cs="Palatino Linotype"/>
                 <w:color w:val="000000"/>
-                <w:sz w:val="19"/>
+                <w:sz w:val="20"/>
                 <w:szCs w:val="17"/>
               </w:rPr>
               <w:t>Partially completed</w:t>

</xml_diff>